<commit_message>
Clean repo and add final v3 artifacts
</commit_message>
<xml_diff>
--- a/docs/requirement-elicitation/01_Prepare_for_Elicitation_Wonton_POS.docx
+++ b/docs/requirement-elicitation/01_Prepare_for_Elicitation_Wonton_POS.docx
@@ -121,7 +121,7 @@
         </w:rPr>
       </w:pPr>
       <w:r>
-        <w:t>Primary participants: Nguyen Quang Anh (project sponsor), operational representatives from cashier/service/kitchen workflows, and the project team: Nguyen Thi Hai My (Business Analyst), Nguyen Dat Vinh (Project Lead / System Analyst), Vuong Gia Ly (Business Analyst), Nguyen Minh Duc (System Analyst), Dang Khanh Huyen (Business Analyst), Le Thanh Dat (System Analyst), Nguyen Dinh Chien (QA / Documentation), Nguyen Thien Hieu (System Analyst).</w:t>
+        <w:t>Primary participants: Nguyen Quang Anh (project sponsor), FOH Manager Representative, BOH Manager Representative, operational representatives from cashier/service/kitchen workflows, and the project team: Nguyen Thi Hai My (Business Analyst), Nguyen Dat Vinh (Project Lead / System Analyst), Vuong Gia Ly (Business Analyst), Nguyen Minh Duc (System Analyst), Dang Khanh Huyen (Business Analyst), Le Thanh Dat (System Analyst), Nguyen Dinh Chien (QA / Documentation), Nguyen Thien Hieu (System Analyst).</w:t>
       </w:r>
     </w:p>
     <w:p>
@@ -164,7 +164,7 @@
         </w:rPr>
       </w:pPr>
       <w:r>
-        <w:t>Language: Vietnamese for working sessions and English for finalized project artifacts. Expertise: the sponsor provides business goals and policy decisions; operational representatives validate the as-is workflow and pain points; the BA/SA team converts findings into BRD content, business rules, and use cases. Location: onsite sessions at HongKong A Hai Crispy Roast Duck Restaurant plus follow-up confirmation through direct communication channels. Influence: the sponsor validates scope and priorities, while operational representatives validate feasibility and usability.</w:t>
+        <w:t>Language: Vietnamese for working sessions and English for finalized project artifacts. Expertise: the sponsor provides business goals and policy decisions; the FOH Manager Representative validates cashier, service, table, payment, handoff, and customer-facing operational needs; the BOH Manager Representative validates kitchen, KDS, item availability, preparation status, and fulfilment exception needs; the BA/SA team converts findings into BRD content, business rules, and use cases. Location: onsite sessions at HongKong A Hai Crispy Roast Duck Restaurant plus follow-up confirmation through direct communication channels. Influence: the sponsor validates scope and priorities, while FOH and BOH managers validate feasibility and usability for their operating areas.</w:t>
       </w:r>
     </w:p>
     <w:p>
@@ -193,7 +193,7 @@
         </w:rPr>
       </w:pPr>
       <w:r>
-        <w:t>Determine logistics - Session set: stakeholder interview (60 minutes), workflow observation (75 minutes during operating hours), questionnaire collection window (3 days), and findings-validation meeting (75 minutes). Participants: sponsor, operational representatives, and BA/SA team members. Resources: elicitation templates, BRD draft, business rules draft, menu references, laptop, mobile devices, and note-taking materials.</w:t>
+        <w:t>Determine logistics - Session set: stakeholder interviews covering the sponsor, FOH Manager, and BOH Manager (60 to 75 minutes total), workflow observation (75 minutes during operating hours), questionnaire collection window (3 days), and findings-validation meeting (75 minutes). Participants: sponsor, FOH Manager Representative, BOH Manager Representative, operational representatives, and BA/SA team members. Resources: elicitation templates, BRD draft, business rules draft, menu references, laptop, mobile devices, and note-taking materials.</w:t>
       </w:r>
     </w:p>
     <w:p>
@@ -549,7 +549,7 @@
         </w:rPr>
       </w:pPr>
       <w:r>
-        <w:t>Key risks: limited stakeholder availability, incomplete operational detail, observation noise during busy hours, and inconsistent interpretation across roles. Mitigation: triangulate findings across interview, questionnaire, observation, and meeting notes; recap decisions at the end of each session; and keep assumptions and open issues visible for follow-up confirmation.</w:t>
+        <w:t>Key risks: limited stakeholder availability, incomplete operational detail, observation noise during busy hours, and inconsistent interpretation across FOH and BOH roles. Mitigation: triangulate findings across sponsor interview, FOH/BOH manager interviews, questionnaire, observation, and meeting notes; recap decisions at the end of each session; and keep assumptions and open issues visible for follow-up confirmation.</w:t>
       </w:r>
     </w:p>
     <w:sectPr>

</xml_diff>